<commit_message>
Clarify CFD terminology and simplify prose throughout manuscript
</commit_message>
<xml_diff>
--- a/submission/cover_letter.docx
+++ b/submission/cover_letter.docx
@@ -43,40 +43,40 @@
         <ns0:rPr/>
       </ns0:pPr>
       <ns0:r>
-        <ns0:t>The manuscript examines why accurate or globally conservative transfer alone does not ensure a faithful restart after mesh replacement. It compares nearest-neighbor Taylor interpolation, barycentric interpolation, Galerkin projection, and a control-volume transfer through static fields, repeated Euler remeshing, controlled airfoil restarts, and fixed-body Reynolds-averaged Navier–Stokes calculations.</ns0:t>
-      </ns0:r>
-    </ns0:p>
-    <ns0:p>
-      <ns0:pPr>
-        <ns0:pStyle ns0:val="Corpodeltesto"/>
-        <ns0:bidi ns0:val="0"/>
-        <ns0:jc ns0:val="left"/>
-        <ns0:rPr/>
-      </ns0:pPr>
-      <ns0:r>
-        <ns0:t>The controlled comparisons separate spatial fidelity from integral preservation and multistep response. Globally corrected first-order interpolation retains the cumulative density integral to roundoff while broadening a transition by 18–26 reference cells; the control-volume transfer retains the integral with at most 0.07 cell of broadening. Independent perturbations of the two BDF2 histories show that an older-history discrepancy alone changes the next-step lift even when the latest history is exact. An exact residual identity explains the signed history contributions, while the computed responses expose the additional role of the receiving dynamics.</ns0:t>
-      </ns0:r>
-    </ns0:p>
-    <ns0:p>
-      <ns0:pPr>
-        <ns0:pStyle ns0:val="Corpodeltesto"/>
-        <ns0:bidi ns0:val="0"/>
-        <ns0:jc ns0:val="left"/>
-        <ns0:rPr/>
-      </ns0:pPr>
-      <ns0:r>
-        <ns0:t>The control-volume construction imposes field-integral constraints on receiving median-dual cells through a Petrov–Galerkin formulation. The manuscript distinguishes these constraints from nodal solver contents and from the properties retained after limiting and boundary treatment. This representation-aware comparison connects the mathematical properties of transfer with their measured consequences during flow evolution.</ns0:t>
-      </ns0:r>
-    </ns0:p>
-    <ns0:p>
-      <ns0:pPr>
-        <ns0:pStyle ns0:val="Corpodeltesto"/>
-        <ns0:bidi ns0:val="0"/>
-        <ns0:jc ns0:val="left"/>
-        <ns0:rPr/>
-      </ns0:pPr>
-      <ns0:r>
-        <ns0:t>With two turbulence closures, Galerkin projection reduces monitored turbulence-inventory defects by factors of approximately 37–247 relative to second-order nearest-neighbor Taylor interpolation, while the control-volume transfer keeps all monitored defects below 5×10^−12 at the stated processing stages. These clear transfer-level differences coexist with aerodynamic differences that remain unresolved under time-step refinement, with incomplete inner convergence for SST. The paper therefore establishes the transfer properties supported by the evidence without inferring an unsupported RANS load ranking.</ns0:t>
+        <ns0:t>The manuscript examines how solution-transfer errors affect unsteady flow simulations with remeshing. It compares nearest-neighbor Taylor interpolation, barycentric interpolation, Galerkin projection, and a control-volume transfer through static fields, Euler simulations with repeated remeshing, controlled airfoil restarts, and fixed-body Reynolds-averaged Navier–Stokes calculations.</ns0:t>
+      </ns0:r>
+    </ns0:p>
+    <ns0:p>
+      <ns0:pPr>
+        <ns0:pStyle ns0:val="Corpodeltesto"/>
+        <ns0:bidi ns0:val="0"/>
+        <ns0:jc ns0:val="left"/>
+        <ns0:rPr/>
+      </ns0:pPr>
+      <ns0:r>
+        <ns0:t>The controlled comparisons distinguish preservation of spatial profiles from conservation and the response of multistep time integration. With globally corrected first-order interpolation, the cumulative mass change across transfers remains at roundoff while the density transition broadens by 18–26 reference cells; the control-volume transfer retains the integral with at most 0.07 cell of broadening. Independent perturbations of the two BDF2 histories show that an error in the older stored state changes the next-step lift even when the latest state matches the reference. An exact residual identity explains the signed contributions of the two stored states, while the computed responses expose the additional role of the target-mesh dynamics.</ns0:t>
+      </ns0:r>
+    </ns0:p>
+    <ns0:p>
+      <ns0:pPr>
+        <ns0:pStyle ns0:val="Corpodeltesto"/>
+        <ns0:bidi ns0:val="0"/>
+        <ns0:jc ns0:val="left"/>
+        <ns0:rPr/>
+      </ns0:pPr>
+      <ns0:r>
+        <ns0:t>The control-volume construction imposes field-integral constraints on target median-dual control volumes through a Petrov–Galerkin formulation. The manuscript distinguishes these constraints from the nodal contributions to the finite-volume integral and from the properties retained after limiting and boundary treatment. This comparison of the discrete representations connects the mathematical properties of transfer with their measured consequences during flow evolution.</ns0:t>
+      </ns0:r>
+    </ns0:p>
+    <ns0:p>
+      <ns0:pPr>
+        <ns0:pStyle ns0:val="Corpodeltesto"/>
+        <ns0:bidi ns0:val="0"/>
+        <ns0:jc ns0:val="left"/>
+        <ns0:rPr/>
+      </ns0:pPr>
+      <ns0:r>
+        <ns0:t>With two turbulence models, Galerkin projection reduces monitored defects in the turbulence-variable integrals by factors of approximately 37–247 relative to second-order nearest-neighbor Taylor interpolation, while the control-volume transfer keeps all monitored defects below 5×10^−12 at the stated processing stages. These clear differences in integral preservation coexist with aerodynamic differences that remain unresolved under time-step refinement, with incomplete iterative convergence for SST. The paper therefore establishes the transfer properties supported by the evidence without inferring an unsupported RANS load ranking.</ns0:t>
       </ns0:r>
     </ns0:p>
     <ns0:p>

</xml_diff>

<commit_message>
Integrate Riemann flux correction and distinguish shock width from mass balance
</commit_message>
<xml_diff>
--- a/submission/cover_letter.docx
+++ b/submission/cover_letter.docx
@@ -43,40 +43,40 @@
         <ns0:rPr/>
       </ns0:pPr>
       <ns0:r>
-        <ns0:t>The manuscript examines how solution-transfer errors affect unsteady flow simulations with remeshing. It compares nearest-neighbor Taylor interpolation, barycentric interpolation, Galerkin projection, and a control-volume transfer through static fields, Euler simulations with repeated remeshing, controlled airfoil restarts, and fixed-body Reynolds-averaged Navier–Stokes calculations.</ns0:t>
-      </ns0:r>
-    </ns0:p>
-    <ns0:p>
-      <ns0:pPr>
-        <ns0:pStyle ns0:val="Corpodeltesto"/>
-        <ns0:bidi ns0:val="0"/>
-        <ns0:jc ns0:val="left"/>
-        <ns0:rPr/>
-      </ns0:pPr>
-      <ns0:r>
-        <ns0:t>The controlled comparisons distinguish preservation of spatial profiles from conservation and the response of multistep time integration. With globally corrected first-order interpolation, the cumulative mass change across transfers remains at roundoff while the density transition broadens by 18–26 reference cells; the control-volume transfer retains the integral with at most 0.07 cell of broadening. Independent perturbations of the two BDF2 histories show that an error in the older stored state changes the next-step lift even when the latest state matches the reference. An exact residual identity explains the signed contributions of the two stored states, while the computed responses expose the additional role of the target-mesh dynamics.</ns0:t>
-      </ns0:r>
-    </ns0:p>
-    <ns0:p>
-      <ns0:pPr>
-        <ns0:pStyle ns0:val="Corpodeltesto"/>
-        <ns0:bidi ns0:val="0"/>
-        <ns0:jc ns0:val="left"/>
-        <ns0:rPr/>
-      </ns0:pPr>
-      <ns0:r>
-        <ns0:t>The control-volume construction imposes field-integral constraints on target median-dual control volumes through a Petrov–Galerkin formulation. The manuscript distinguishes these constraints from the nodal contributions to the finite-volume integral and from the properties retained after limiting and boundary treatment. This comparison of the discrete representations connects the mathematical properties of transfer with their measured consequences during flow evolution.</ns0:t>
-      </ns0:r>
-    </ns0:p>
-    <ns0:p>
-      <ns0:pPr>
-        <ns0:pStyle ns0:val="Corpodeltesto"/>
-        <ns0:bidi ns0:val="0"/>
-        <ns0:jc ns0:val="left"/>
-        <ns0:rPr/>
-      </ns0:pPr>
-      <ns0:r>
-        <ns0:t>With two turbulence models, Galerkin projection reduces monitored defects in the turbulence-variable integrals by factors of approximately 37–247 relative to second-order nearest-neighbor Taylor interpolation, while the control-volume transfer keeps all monitored defects below 5×10^−12 at the stated processing stages. These clear differences in integral preservation coexist with aerodynamic differences that remain unresolved under time-step refinement, with incomplete iterative convergence for SST. The paper therefore establishes the transfer properties supported by the evidence without inferring an unsupported RANS load ranking.</ns0:t>
+        <ns0:t>The manuscript examines how solution-transfer errors affect unsteady simulations with remeshing. It compares nearest-neighbor Taylor interpolation, barycentric interpolation, Galerkin projection, and control-volume transfer through static fields, a Riemann problem with repeated remeshing, controlled BDF2 airfoil restarts, and fixed-body Reynolds-averaged Navier–Stokes calculations.</ns0:t>
+      </ns0:r>
+    </ns0:p>
+    <ns0:p>
+      <ns0:pPr>
+        <ns0:pStyle ns0:val="Corpodeltesto"/>
+        <ns0:bidi ns0:val="0"/>
+        <ns0:jc ns0:val="left"/>
+        <ns0:rPr/>
+      </ns0:pPr>
+      <ns0:r>
+        <ns0:t>The Riemann tests distinguish preservation of wave structure from integral preservation during transfer and conservation over the full calculation. Contact smearing can contaminate a crossing-based transition width, so shock-only widths are assessed separately. Near-roundoff transfer defects can coexist with finite mass drift during the CFD steps when non-local limiting disturbs the far field and permits flux through the open boundaries. A matched comparison of locally conservative flux correction maintains the final relative mass and energy drift below 5×10^−13 and 7×10^−13, respectively, and modestly reduces Galerkin and control-volume density errors. The paper reports the associated relaxed-bound extrema, incomplete application of correction flux at the limiting-pass cap, and wall-compatibility limitation.</ns0:t>
+      </ns0:r>
+    </ns0:p>
+    <ns0:p>
+      <ns0:pPr>
+        <ns0:pStyle ns0:val="Corpodeltesto"/>
+        <ns0:bidi ns0:val="0"/>
+        <ns0:jc ns0:val="left"/>
+        <ns0:rPr/>
+      </ns0:pPr>
+      <ns0:r>
+        <ns0:t>The controlled BDF2 restarts isolate a different effect: an error in the older stored state changes the next-step lift even when the latest state matches the target-mesh reference. An exact residual identity explains the signed contributions of the two stored states. In the RANS cases, improved preservation of transferred integrals does not establish an aerodynamic ranking, because load differences remain sensitive to time-step refinement and iterative convergence. These airfoil cases use the standard transfer treatment and do not establish an aerodynamic result for local flux correction.</ns0:t>
+      </ns0:r>
+    </ns0:p>
+    <ns0:p>
+      <ns0:pPr>
+        <ns0:pStyle ns0:val="Corpodeltesto"/>
+        <ns0:bidi ns0:val="0"/>
+        <ns0:jc ns0:val="left"/>
+        <ns0:rPr/>
+      </ns0:pPr>
+      <ns0:r>
+        <ns0:t>The contribution is a controlled comparison of the properties retained by the transfer operators and their consequences for the evolving numerical solution. The main text and supplementary material define the profile and conservation diagnostics, report the matched flux-correction results, and distinguish measured changes from claims requiring stronger numerical resolution.</ns0:t>
       </ns0:r>
     </ns0:p>
     <ns0:p>

</xml_diff>